<commit_message>
system and applicant user
</commit_message>
<xml_diff>
--- a/Company_Registration_System_Industry_DB_Design.docx
+++ b/Company_Registration_System_Industry_DB_Design.docx
@@ -892,6 +892,39 @@
           <w:rFonts w:ascii="Times New Roman" w:hAnsi="Times New Roman" w:cs="Times New Roman"/>
         </w:rPr>
       </w:pPr>
+      <w:r>
+        <w:rPr>
+          <w:rFonts w:ascii="Times New Roman" w:hAnsi="Times New Roman" w:cs="Times New Roman"/>
+        </w:rPr>
+        <w:t xml:space="preserve">UserId </w:t>
+      </w:r>
+      <w:r>
+        <w:rPr>
+          <w:rFonts w:ascii="Times New Roman" w:hAnsi="Times New Roman" w:cs="Times New Roman"/>
+        </w:rPr>
+        <w:t xml:space="preserve">BIGINT NOT NULL FOREIGN KEY REFERENCES </w:t>
+      </w:r>
+      <w:r>
+        <w:rPr>
+          <w:rFonts w:ascii="Times New Roman" w:hAnsi="Times New Roman" w:cs="Times New Roman"/>
+        </w:rPr>
+        <w:t>SystemUsers</w:t>
+      </w:r>
+      <w:bookmarkStart w:id="0" w:name="_GoBack"/>
+      <w:bookmarkEnd w:id="0"/>
+      <w:r>
+        <w:rPr>
+          <w:rFonts w:ascii="Times New Roman" w:hAnsi="Times New Roman" w:cs="Times New Roman"/>
+        </w:rPr>
+        <w:t>(Id)</w:t>
+      </w:r>
+    </w:p>
+    <w:p>
+      <w:pPr>
+        <w:rPr>
+          <w:rFonts w:ascii="Times New Roman" w:hAnsi="Times New Roman" w:cs="Times New Roman"/>
+        </w:rPr>
+      </w:pPr>
       <w:proofErr w:type="spellStart"/>
       <w:r>
         <w:rPr>
@@ -1277,7 +1310,6 @@
           <w:sz w:val="26"/>
           <w:szCs w:val="26"/>
         </w:rPr>
-        <w:lastRenderedPageBreak/>
         <w:t xml:space="preserve">5. </w:t>
       </w:r>
       <w:proofErr w:type="spellStart"/>
@@ -1860,7 +1892,6 @@
           <w:sz w:val="26"/>
           <w:szCs w:val="26"/>
         </w:rPr>
-        <w:lastRenderedPageBreak/>
         <w:t>7. CompanyShareCapital (Share Capital Structure)</w:t>
       </w:r>
     </w:p>
@@ -2505,7 +2536,6 @@
           <w:sz w:val="26"/>
           <w:szCs w:val="26"/>
         </w:rPr>
-        <w:lastRenderedPageBreak/>
         <w:t xml:space="preserve">9. </w:t>
       </w:r>
       <w:proofErr w:type="spellStart"/>
@@ -3146,13 +3176,7 @@
         <w:rPr>
           <w:rFonts w:ascii="Times New Roman" w:hAnsi="Times New Roman" w:cs="Times New Roman"/>
         </w:rPr>
-        <w:t>CompanyApplicants</w:t>
-      </w:r>
-      <w:r>
-        <w:rPr>
-          <w:rFonts w:ascii="Times New Roman" w:hAnsi="Times New Roman" w:cs="Times New Roman"/>
-        </w:rPr>
-        <w:t>(</w:t>
+        <w:t>CompanyApplicants(</w:t>
       </w:r>
       <w:proofErr w:type="gramEnd"/>
       <w:r>
@@ -3172,6 +3196,7 @@
         <w:rPr>
           <w:rFonts w:ascii="Times New Roman" w:hAnsi="Times New Roman" w:cs="Times New Roman"/>
         </w:rPr>
+        <w:lastRenderedPageBreak/>
         <w:t>EmailConfirmed</w:t>
       </w:r>
       <w:proofErr w:type="spellEnd"/>
@@ -3229,18 +3254,7 @@
           <w:sz w:val="26"/>
           <w:szCs w:val="26"/>
         </w:rPr>
-        <w:lastRenderedPageBreak/>
-        <w:t>11.</w:t>
-      </w:r>
-      <w:r>
-        <w:rPr>
-          <w:rStyle w:val="Strong"/>
-          <w:rFonts w:ascii="Times New Roman" w:hAnsi="Times New Roman" w:cs="Times New Roman"/>
-          <w:color w:val="00B0F0"/>
-          <w:sz w:val="26"/>
-          <w:szCs w:val="26"/>
-        </w:rPr>
-        <w:t>EmailConfirmationTokens (Email Verification Tokens / System Use)</w:t>
+        <w:t>11.EmailConfirmationTokens (Email Verification Tokens / System Use)</w:t>
       </w:r>
       <w:r>
         <w:rPr>
@@ -3333,8 +3347,6 @@
         </w:rPr>
         <w:br/>
       </w:r>
-      <w:bookmarkStart w:id="0" w:name="_GoBack"/>
-      <w:bookmarkEnd w:id="0"/>
       <w:proofErr w:type="spellStart"/>
       <w:r>
         <w:rPr>
@@ -15361,7 +15373,7 @@
 </file>
 
 <file path=customXml/itemProps1.xml><?xml version="1.0" encoding="utf-8"?>
-<ds:datastoreItem xmlns:ds="http://schemas.openxmlformats.org/officeDocument/2006/customXml" ds:itemID="{EBC45C89-3410-46C9-AB41-4CD62D249001}">
+<ds:datastoreItem xmlns:ds="http://schemas.openxmlformats.org/officeDocument/2006/customXml" ds:itemID="{84AFDDE2-075D-4D88-9BF5-FDBF3DAF96A5}">
   <ds:schemaRefs>
     <ds:schemaRef ds:uri="http://schemas.openxmlformats.org/officeDocument/2006/bibliography"/>
   </ds:schemaRefs>

</xml_diff>